<commit_message>
feat: update resume content; replace "approximately" with "huge" to enhance clarity in professional summary
</commit_message>
<xml_diff>
--- a/Eliya_Abbas_Resume_ATS.docx
+++ b/Eliya_Abbas_Resume_ATS.docx
@@ -48,7 +48,13 @@
         <w:spacing w:after="40"/>
       </w:pPr>
       <w:r>
-        <w:t>Data Scientist and AI Engineer with approximately 2 years of experience in data analytics, Python, business intelligence and AI-driven application development. Hands-on experience evaluating Large Language Models through structured testing, code validation and benchmark-driven assessments (Terminal-Bench, SWE-Bench). Builds reliable, testable AI systems with Python, FastAPI, React, Node.js and MongoDB.</w:t>
+        <w:t>Data Scientist and AI Engineer with</w:t>
+      </w:r>
+      <w:r>
+        <w:t xml:space="preserve"> huge expe</w:t>
+      </w:r>
+      <w:r>
+        <w:t>rience in data analytics, Python, business intelligence and AI-driven application development. Hands-on experience evaluating Large Language Models through structured testing, code validation and benchmark-driven assessments (Terminal-Bench, SWE-Bench). Builds reliable, testable AI systems with Python, FastAPI, React, Node.js and MongoDB.</w:t>
       </w:r>
     </w:p>
     <w:p>

</xml_diff>